<commit_message>
v4 DOCX: add trimmed references appendix (22 sources)
</commit_message>
<xml_diff>
--- a/How-to-Write-Content-AI-Engines-Actually-Cite-Writers-Edition-v4.docx
+++ b/How-to-Write-Content-AI-Engines-Actually-Cite-Writers-Edition-v4.docx
@@ -2,7 +2,7 @@
 <file path=word/document.xml><?xml version="1.0" encoding="utf-8"?>
 <w:document xmlns:w="http://schemas.openxmlformats.org/wordprocessingml/2006/main" xmlns:m="http://schemas.openxmlformats.org/officeDocument/2006/math" xmlns:r="http://schemas.openxmlformats.org/officeDocument/2006/relationships" xmlns:o="urn:schemas-microsoft-com:office:office" xmlns:v="urn:schemas-microsoft-com:vml" xmlns:w10="urn:schemas-microsoft-com:office:word" xmlns:a="http://schemas.openxmlformats.org/drawingml/2006/main" xmlns:pic="http://schemas.openxmlformats.org/drawingml/2006/picture" xmlns:wp="http://schemas.openxmlformats.org/drawingml/2006/wordprocessingDrawing">
   <w:body>
-    <w:bookmarkStart w:id="16" w:name="Xdc82d35a06b0f8f56cf6e70a96b0a1a88e68aa2"/>
+    <w:bookmarkStart w:id="40" w:name="Xdc82d35a06b0f8f56cf6e70a96b0a1a88e68aa2"/>
     <w:p>
       <w:pPr>
         <w:pStyle w:val="Heading1"/>
@@ -1668,8 +1668,581 @@
         <w:t xml:space="preserve">If applying a tip makes the copy worse, don’t apply it. These are recommendations built from what gets cited, not laws of grammar. The reader comes first: a page that reads naturally and gets quoted sometimes beats a page that reads mechanically and gets quoted often. Write the natural sentence, keep the intent of the tip, and move on.</w:t>
       </w:r>
     </w:p>
+    <w:p>
+      <w:r>
+        <w:pict>
+          <v:rect style="width:0;height:1.5pt" o:hralign="center" o:hrstd="t" o:hr="t"/>
+        </w:pict>
+      </w:r>
+    </w:p>
     <w:bookmarkEnd w:id="15"/>
+    <w:bookmarkStart w:id="16" w:name="appendix-evidence-strength-map"/>
+    <w:p>
+      <w:pPr>
+        <w:pStyle w:val="Heading2"/>
+      </w:pPr>
+      <w:r>
+        <w:t xml:space="preserve">Appendix — Evidence strength map</w:t>
+      </w:r>
+    </w:p>
+    <w:p>
+      <w:pPr>
+        <w:pStyle w:val="Compact"/>
+        <w:numPr>
+          <w:ilvl w:val="0"/>
+          <w:numId w:val="1012"/>
+        </w:numPr>
+      </w:pPr>
+      <w:r>
+        <w:rPr>
+          <w:b/>
+          <w:bCs/>
+        </w:rPr>
+        <w:t xml:space="preserve">Measured:</w:t>
+      </w:r>
+      <w:r>
+        <w:t xml:space="preserve"> </w:t>
+      </w:r>
+      <w:r>
+        <w:t xml:space="preserve">controlled studies or large audits. Gatekeeper odds ratios (SIGIR ’26, 252,000 trials), Texta 1,000-site audit, AirOps 16,851-query fan-out, Ahrefs 1.4M-prompt study, Google patents, arXiv studies.</w:t>
+      </w:r>
+    </w:p>
+    <w:p>
+      <w:pPr>
+        <w:pStyle w:val="Compact"/>
+        <w:numPr>
+          <w:ilvl w:val="0"/>
+          <w:numId w:val="1012"/>
+        </w:numPr>
+      </w:pPr>
+      <w:r>
+        <w:rPr>
+          <w:b/>
+          <w:bCs/>
+        </w:rPr>
+        <w:t xml:space="preserve">Vendor:</w:t>
+      </w:r>
+      <w:r>
+        <w:t xml:space="preserve"> </w:t>
+      </w:r>
+      <w:r>
+        <w:t xml:space="preserve">vendor-funded studies with a bias to read. Search Engine Land fake-brand, Trustpilot × Seer. Treat numbers as directional.</w:t>
+      </w:r>
+    </w:p>
+    <w:p>
+      <w:pPr>
+        <w:pStyle w:val="Compact"/>
+        <w:numPr>
+          <w:ilvl w:val="0"/>
+          <w:numId w:val="1012"/>
+        </w:numPr>
+      </w:pPr>
+      <w:r>
+        <w:rPr>
+          <w:b/>
+          <w:bCs/>
+        </w:rPr>
+        <w:t xml:space="preserve">Field:</w:t>
+      </w:r>
+      <w:r>
+        <w:t xml:space="preserve"> </w:t>
+      </w:r>
+      <w:r>
+        <w:t xml:space="preserve">practitioner observation, small sample. Charles Floate’s sentence-craft rules. Highest trust where lab and field agree.</w:t>
+      </w:r>
+    </w:p>
+    <w:p>
+      <w:pPr>
+        <w:pStyle w:val="Compact"/>
+        <w:numPr>
+          <w:ilvl w:val="0"/>
+          <w:numId w:val="1012"/>
+        </w:numPr>
+      </w:pPr>
+      <w:r>
+        <w:rPr>
+          <w:b/>
+          <w:bCs/>
+        </w:rPr>
+        <w:t xml:space="preserve">Contested:</w:t>
+      </w:r>
+      <w:r>
+        <w:t xml:space="preserve"> </w:t>
+      </w:r>
+      <w:r>
+        <w:t xml:space="preserve">none in this edition. The one contested topic from earlier editions (schema markup) is outside the writer’s scope and stays in the research edition.</w:t>
+      </w:r>
+    </w:p>
     <w:bookmarkEnd w:id="16"/>
+    <w:bookmarkStart w:id="39" w:name="X7939a738dc50403e78a7c206fe615d149af9d58"/>
+    <w:p>
+      <w:pPr>
+        <w:pStyle w:val="Heading2"/>
+      </w:pPr>
+      <w:r>
+        <w:t xml:space="preserve">Sources Index (trimmed to this edition, all verified live 2026-08-28)</w:t>
+      </w:r>
+    </w:p>
+    <w:p>
+      <w:pPr>
+        <w:pStyle w:val="Compact"/>
+        <w:numPr>
+          <w:ilvl w:val="0"/>
+          <w:numId w:val="1013"/>
+        </w:numPr>
+      </w:pPr>
+      <w:hyperlink r:id="rId17">
+        <w:r>
+          <w:rPr>
+            <w:rStyle w:val="Hyperlink"/>
+          </w:rPr>
+          <w:t xml:space="preserve">arXiv:2606.25787 – How LLMs Source Brand Reputation</w:t>
+        </w:r>
+      </w:hyperlink>
+    </w:p>
+    <w:p>
+      <w:pPr>
+        <w:pStyle w:val="Compact"/>
+        <w:numPr>
+          <w:ilvl w:val="0"/>
+          <w:numId w:val="1013"/>
+        </w:numPr>
+      </w:pPr>
+      <w:hyperlink r:id="rId18">
+        <w:r>
+          <w:rPr>
+            <w:rStyle w:val="Hyperlink"/>
+          </w:rPr>
+          <w:t xml:space="preserve">arXiv:2605.25517 – What Gets Cited: Competitive GEO (SIGIR ’26)</w:t>
+        </w:r>
+      </w:hyperlink>
+    </w:p>
+    <w:p>
+      <w:pPr>
+        <w:pStyle w:val="Compact"/>
+        <w:numPr>
+          <w:ilvl w:val="0"/>
+          <w:numId w:val="1013"/>
+        </w:numPr>
+      </w:pPr>
+      <w:hyperlink r:id="rId19">
+        <w:r>
+          <w:rPr>
+            <w:rStyle w:val="Hyperlink"/>
+          </w:rPr>
+          <w:t xml:space="preserve">arXiv:2606.21595 – Per-Entity Bias Mapping / Brand Hallucination Paradox</w:t>
+        </w:r>
+      </w:hyperlink>
+    </w:p>
+    <w:p>
+      <w:pPr>
+        <w:pStyle w:val="Compact"/>
+        <w:numPr>
+          <w:ilvl w:val="0"/>
+          <w:numId w:val="1013"/>
+        </w:numPr>
+      </w:pPr>
+      <w:hyperlink r:id="rId20">
+        <w:r>
+          <w:rPr>
+            <w:rStyle w:val="Hyperlink"/>
+          </w:rPr>
+          <w:t xml:space="preserve">arXiv:2512.09483 – Source Coverage and Citation Bias</w:t>
+        </w:r>
+      </w:hyperlink>
+    </w:p>
+    <w:p>
+      <w:pPr>
+        <w:pStyle w:val="Compact"/>
+        <w:numPr>
+          <w:ilvl w:val="0"/>
+          <w:numId w:val="1013"/>
+        </w:numPr>
+      </w:pPr>
+      <w:hyperlink r:id="rId21">
+        <w:r>
+          <w:rPr>
+            <w:rStyle w:val="Hyperlink"/>
+          </w:rPr>
+          <w:t xml:space="preserve">AirOps – The Fan-Out Effect (16,851 queries)</w:t>
+        </w:r>
+      </w:hyperlink>
+    </w:p>
+    <w:p>
+      <w:pPr>
+        <w:pStyle w:val="Compact"/>
+        <w:numPr>
+          <w:ilvl w:val="0"/>
+          <w:numId w:val="1013"/>
+        </w:numPr>
+      </w:pPr>
+      <w:hyperlink r:id="rId22">
+        <w:r>
+          <w:rPr>
+            <w:rStyle w:val="Hyperlink"/>
+          </w:rPr>
+          <w:t xml:space="preserve">Metehan – ChatGPT uses Reciprocal Rank Fusion (k=60)</w:t>
+        </w:r>
+      </w:hyperlink>
+    </w:p>
+    <w:p>
+      <w:pPr>
+        <w:pStyle w:val="Compact"/>
+        <w:numPr>
+          <w:ilvl w:val="0"/>
+          <w:numId w:val="1013"/>
+        </w:numPr>
+      </w:pPr>
+      <w:hyperlink r:id="rId23">
+        <w:r>
+          <w:rPr>
+            <w:rStyle w:val="Hyperlink"/>
+          </w:rPr>
+          <w:t xml:space="preserve">Ahrefs – Why ChatGPT cites pages (1.4M prompts)</w:t>
+        </w:r>
+      </w:hyperlink>
+    </w:p>
+    <w:p>
+      <w:pPr>
+        <w:pStyle w:val="Compact"/>
+        <w:numPr>
+          <w:ilvl w:val="0"/>
+          <w:numId w:val="1013"/>
+        </w:numPr>
+      </w:pPr>
+      <w:hyperlink r:id="rId24">
+        <w:r>
+          <w:rPr>
+            <w:rStyle w:val="Hyperlink"/>
+          </w:rPr>
+          <w:t xml:space="preserve">Suganthan – How ChatGPT picks sources, part 1</w:t>
+        </w:r>
+      </w:hyperlink>
+    </w:p>
+    <w:p>
+      <w:pPr>
+        <w:pStyle w:val="Compact"/>
+        <w:numPr>
+          <w:ilvl w:val="0"/>
+          <w:numId w:val="1013"/>
+        </w:numPr>
+      </w:pPr>
+      <w:hyperlink r:id="rId25">
+        <w:r>
+          <w:rPr>
+            <w:rStyle w:val="Hyperlink"/>
+          </w:rPr>
+          <w:t xml:space="preserve">Suganthan – How ChatGPT picks sources, part 2 (runner-ups)</w:t>
+        </w:r>
+      </w:hyperlink>
+    </w:p>
+    <w:p>
+      <w:pPr>
+        <w:pStyle w:val="Compact"/>
+        <w:numPr>
+          <w:ilvl w:val="0"/>
+          <w:numId w:val="1013"/>
+        </w:numPr>
+      </w:pPr>
+      <w:hyperlink r:id="rId26">
+        <w:r>
+          <w:rPr>
+            <w:rStyle w:val="Hyperlink"/>
+          </w:rPr>
+          <w:t xml:space="preserve">Texta – ChatGPT citation study (1,000 websites)</w:t>
+        </w:r>
+      </w:hyperlink>
+    </w:p>
+    <w:p>
+      <w:pPr>
+        <w:pStyle w:val="Compact"/>
+        <w:numPr>
+          <w:ilvl w:val="0"/>
+          <w:numId w:val="1013"/>
+        </w:numPr>
+      </w:pPr>
+      <w:hyperlink r:id="rId27">
+        <w:r>
+          <w:rPr>
+            <w:rStyle w:val="Hyperlink"/>
+          </w:rPr>
+          <w:t xml:space="preserve">Presenc.ai – Google AI Overviews citation patterns</w:t>
+        </w:r>
+      </w:hyperlink>
+    </w:p>
+    <w:p>
+      <w:pPr>
+        <w:pStyle w:val="Compact"/>
+        <w:numPr>
+          <w:ilvl w:val="0"/>
+          <w:numId w:val="1013"/>
+        </w:numPr>
+      </w:pPr>
+      <w:hyperlink r:id="rId28">
+        <w:r>
+          <w:rPr>
+            <w:rStyle w:val="Hyperlink"/>
+          </w:rPr>
+          <w:t xml:space="preserve">DeltaV Digital – AI citation study</w:t>
+        </w:r>
+      </w:hyperlink>
+    </w:p>
+    <w:p>
+      <w:pPr>
+        <w:pStyle w:val="Compact"/>
+        <w:numPr>
+          <w:ilvl w:val="0"/>
+          <w:numId w:val="1013"/>
+        </w:numPr>
+      </w:pPr>
+      <w:hyperlink r:id="rId29">
+        <w:r>
+          <w:rPr>
+            <w:rStyle w:val="Hyperlink"/>
+          </w:rPr>
+          <w:t xml:space="preserve">Claude web search tool – cited_text cap</w:t>
+        </w:r>
+      </w:hyperlink>
+    </w:p>
+    <w:p>
+      <w:pPr>
+        <w:pStyle w:val="Compact"/>
+        <w:numPr>
+          <w:ilvl w:val="0"/>
+          <w:numId w:val="1013"/>
+        </w:numPr>
+      </w:pPr>
+      <w:hyperlink r:id="rId30">
+        <w:r>
+          <w:rPr>
+            <w:rStyle w:val="Hyperlink"/>
+          </w:rPr>
+          <w:t xml:space="preserve">Trustpilot × Seer – What AI says about your brand</w:t>
+        </w:r>
+      </w:hyperlink>
+    </w:p>
+    <w:p>
+      <w:pPr>
+        <w:pStyle w:val="Compact"/>
+        <w:numPr>
+          <w:ilvl w:val="0"/>
+          <w:numId w:val="1013"/>
+        </w:numPr>
+      </w:pPr>
+      <w:hyperlink r:id="rId31">
+        <w:r>
+          <w:rPr>
+            <w:rStyle w:val="Hyperlink"/>
+          </w:rPr>
+          <w:t xml:space="preserve">Seer Interactive – one bad review amplified 67x</w:t>
+        </w:r>
+      </w:hyperlink>
+    </w:p>
+    <w:p>
+      <w:pPr>
+        <w:pStyle w:val="Compact"/>
+        <w:numPr>
+          <w:ilvl w:val="0"/>
+          <w:numId w:val="1013"/>
+        </w:numPr>
+      </w:pPr>
+      <w:hyperlink r:id="rId32">
+        <w:r>
+          <w:rPr>
+            <w:rStyle w:val="Hyperlink"/>
+          </w:rPr>
+          <w:t xml:space="preserve">Reboot – controlled GEO experiment</w:t>
+        </w:r>
+      </w:hyperlink>
+    </w:p>
+    <w:p>
+      <w:pPr>
+        <w:pStyle w:val="Compact"/>
+        <w:numPr>
+          <w:ilvl w:val="0"/>
+          <w:numId w:val="1013"/>
+        </w:numPr>
+      </w:pPr>
+      <w:hyperlink r:id="rId33">
+        <w:r>
+          <w:rPr>
+            <w:rStyle w:val="Hyperlink"/>
+          </w:rPr>
+          <w:t xml:space="preserve">Search Engine Land – fake-brand AI search experiment</w:t>
+        </w:r>
+      </w:hyperlink>
+    </w:p>
+    <w:p>
+      <w:pPr>
+        <w:pStyle w:val="Compact"/>
+        <w:numPr>
+          <w:ilvl w:val="0"/>
+          <w:numId w:val="1013"/>
+        </w:numPr>
+      </w:pPr>
+      <w:hyperlink r:id="rId34">
+        <w:r>
+          <w:rPr>
+            <w:rStyle w:val="Hyperlink"/>
+          </w:rPr>
+          <w:t xml:space="preserve">GEO measurement study – 50,000 AI citations in 90 days</w:t>
+        </w:r>
+      </w:hyperlink>
+    </w:p>
+    <w:p>
+      <w:pPr>
+        <w:pStyle w:val="Compact"/>
+        <w:numPr>
+          <w:ilvl w:val="0"/>
+          <w:numId w:val="1013"/>
+        </w:numPr>
+      </w:pPr>
+      <w:hyperlink r:id="rId35">
+        <w:r>
+          <w:rPr>
+            <w:rStyle w:val="Hyperlink"/>
+          </w:rPr>
+          <w:t xml:space="preserve">WinWithSEO – State of AI Search 2026</w:t>
+        </w:r>
+      </w:hyperlink>
+    </w:p>
+    <w:p>
+      <w:pPr>
+        <w:pStyle w:val="Compact"/>
+        <w:numPr>
+          <w:ilvl w:val="0"/>
+          <w:numId w:val="1013"/>
+        </w:numPr>
+      </w:pPr>
+      <w:hyperlink r:id="rId36">
+        <w:r>
+          <w:rPr>
+            <w:rStyle w:val="Hyperlink"/>
+          </w:rPr>
+          <w:t xml:space="preserve">Promptwatch – Reddit citations dropping in ChatGPT</w:t>
+        </w:r>
+      </w:hyperlink>
+    </w:p>
+    <w:p>
+      <w:pPr>
+        <w:pStyle w:val="Compact"/>
+        <w:numPr>
+          <w:ilvl w:val="0"/>
+          <w:numId w:val="1013"/>
+        </w:numPr>
+      </w:pPr>
+      <w:hyperlink r:id="rId37">
+        <w:r>
+          <w:rPr>
+            <w:rStyle w:val="Hyperlink"/>
+          </w:rPr>
+          <w:t xml:space="preserve">gpt-insights.de – ChatGPT multilingual redundancy leak</w:t>
+        </w:r>
+      </w:hyperlink>
+    </w:p>
+    <w:p>
+      <w:pPr>
+        <w:pStyle w:val="Compact"/>
+        <w:numPr>
+          <w:ilvl w:val="0"/>
+          <w:numId w:val="1013"/>
+        </w:numPr>
+      </w:pPr>
+      <w:hyperlink r:id="rId38">
+        <w:r>
+          <w:rPr>
+            <w:rStyle w:val="Hyperlink"/>
+          </w:rPr>
+          <w:t xml:space="preserve">Charles Floate (</w:t>
+        </w:r>
+        <w:r>
+          <w:rPr>
+            <w:rStyle w:val="Hyperlink"/>
+          </w:rPr>
+          <w:t xml:space="preserve">@Charles_SEO</w:t>
+        </w:r>
+        <w:r>
+          <w:rPr>
+            <w:rStyle w:val="Hyperlink"/>
+          </w:rPr>
+          <w:t xml:space="preserve">) X archive – sentence craft rules</w:t>
+        </w:r>
+      </w:hyperlink>
+    </w:p>
+    <w:p>
+      <w:pPr>
+        <w:pStyle w:val="FirstParagraph"/>
+      </w:pPr>
+      <w:r>
+        <w:rPr>
+          <w:b/>
+          <w:bCs/>
+        </w:rPr>
+        <w:t xml:space="preserve">Evidence files (for audit):</w:t>
+      </w:r>
+      <w:r>
+        <w:t xml:space="preserve"> </w:t>
+      </w:r>
+      <w:r>
+        <w:t xml:space="preserve">6 immutable raws in</w:t>
+      </w:r>
+      <w:r>
+        <w:t xml:space="preserve"> </w:t>
+      </w:r>
+      <w:r>
+        <w:rPr>
+          <w:rStyle w:val="VerbatimChar"/>
+        </w:rPr>
+        <w:t xml:space="preserve">wiki/raw/primary/boruto-citeable-content-hunt-2026-08-23/raw-01</w:t>
+      </w:r>
+      <w:r>
+        <w:t xml:space="preserve"> </w:t>
+      </w:r>
+      <w:r>
+        <w:t xml:space="preserve">through</w:t>
+      </w:r>
+      <w:r>
+        <w:t xml:space="preserve"> </w:t>
+      </w:r>
+      <w:r>
+        <w:rPr>
+          <w:rStyle w:val="VerbatimChar"/>
+        </w:rPr>
+        <w:t xml:space="preserve">raw-06</w:t>
+      </w:r>
+      <w:r>
+        <w:t xml:space="preserve">, plus 8 raws in</w:t>
+      </w:r>
+      <w:r>
+        <w:t xml:space="preserve"> </w:t>
+      </w:r>
+      <w:r>
+        <w:rPr>
+          <w:rStyle w:val="VerbatimChar"/>
+        </w:rPr>
+        <w:t xml:space="preserve">wiki/raw/primary/boruto-affiliate-geo-hunt-2026-08-25/</w:t>
+      </w:r>
+      <w:r>
+        <w:t xml:space="preserve"> </w:t>
+      </w:r>
+      <w:r>
+        <w:t xml:space="preserve">and</w:t>
+      </w:r>
+      <w:r>
+        <w:t xml:space="preserve"> </w:t>
+      </w:r>
+      <w:r>
+        <w:rPr>
+          <w:rStyle w:val="VerbatimChar"/>
+        </w:rPr>
+        <w:t xml:space="preserve">wiki/raw/articles/external-promptwatch-reddit-citations-dropping-chatgpt.md</w:t>
+      </w:r>
+      <w:r>
+        <w:t xml:space="preserve">.</w:t>
+      </w:r>
+    </w:p>
+    <w:bookmarkEnd w:id="39"/>
+    <w:bookmarkEnd w:id="40"/>
     <w:sectPr>
       <w:footnotePr>
         <w:numRestart w:val="eachSect"/>
@@ -1854,6 +2427,109 @@
       <w:pPr>
         <w:ind w:left="6480" w:hanging="360"/>
       </w:pPr>
+    </w:lvl>
+  </w:abstractNum>
+  <w:abstractNum w:abstractNumId="991">
+    <w:nsid w:val="0000A991"/>
+    <w:multiLevelType w:val="multilevel"/>
+    <w:lvl w:ilvl="0">
+      <w:numFmt w:val="bullet"/>
+      <w:lvlText w:val=""/>
+      <w:lvlJc w:val="left"/>
+      <w:pPr>
+        <w:ind w:left="720" w:hanging="360"/>
+      </w:pPr>
+      <w:rPr>
+        <w:rFonts w:ascii="Symbol" w:hAnsi="Symbol" w:cs="Symbol" w:hint="default"/>
+      </w:rPr>
+    </w:lvl>
+    <w:lvl w:ilvl="1">
+      <w:numFmt w:val="bullet"/>
+      <w:lvlText w:val="o"/>
+      <w:lvlJc w:val="left"/>
+      <w:pPr>
+        <w:ind w:left="1440" w:hanging="360"/>
+      </w:pPr>
+      <w:rPr>
+        <w:rFonts w:ascii="Courier New" w:hAnsi="Courier New" w:cs="Courier New" w:hint="default"/>
+      </w:rPr>
+    </w:lvl>
+    <w:lvl w:ilvl="2">
+      <w:numFmt w:val="bullet"/>
+      <w:lvlText w:val=""/>
+      <w:lvlJc w:val="left"/>
+      <w:pPr>
+        <w:ind w:left="2160" w:hanging="360"/>
+      </w:pPr>
+      <w:rPr>
+        <w:rFonts w:ascii="Wingdings" w:hAnsi="Wingdings" w:cs="Wingdings" w:hint="default"/>
+      </w:rPr>
+    </w:lvl>
+    <w:lvl w:ilvl="3">
+      <w:numFmt w:val="bullet"/>
+      <w:lvlText w:val=""/>
+      <w:lvlJc w:val="left"/>
+      <w:pPr>
+        <w:ind w:left="2880" w:hanging="360"/>
+      </w:pPr>
+      <w:rPr>
+        <w:rFonts w:ascii="Symbol" w:hAnsi="Symbol" w:cs="Symbol" w:hint="default"/>
+      </w:rPr>
+    </w:lvl>
+    <w:lvl w:ilvl="4">
+      <w:numFmt w:val="bullet"/>
+      <w:lvlText w:val="o"/>
+      <w:lvlJc w:val="left"/>
+      <w:pPr>
+        <w:ind w:left="3600" w:hanging="360"/>
+      </w:pPr>
+      <w:rPr>
+        <w:rFonts w:ascii="Courier New" w:hAnsi="Courier New" w:cs="Courier New" w:hint="default"/>
+      </w:rPr>
+    </w:lvl>
+    <w:lvl w:ilvl="5">
+      <w:numFmt w:val="bullet"/>
+      <w:lvlText w:val=""/>
+      <w:lvlJc w:val="left"/>
+      <w:pPr>
+        <w:ind w:left="4320" w:hanging="360"/>
+      </w:pPr>
+      <w:rPr>
+        <w:rFonts w:ascii="Wingdings" w:hAnsi="Wingdings" w:cs="Wingdings" w:hint="default"/>
+      </w:rPr>
+    </w:lvl>
+    <w:lvl w:ilvl="6">
+      <w:numFmt w:val="bullet"/>
+      <w:lvlText w:val=""/>
+      <w:lvlJc w:val="left"/>
+      <w:pPr>
+        <w:ind w:left="5040" w:hanging="360"/>
+      </w:pPr>
+      <w:rPr>
+        <w:rFonts w:ascii="Symbol" w:hAnsi="Symbol" w:cs="Symbol" w:hint="default"/>
+      </w:rPr>
+    </w:lvl>
+    <w:lvl w:ilvl="7">
+      <w:numFmt w:val="bullet"/>
+      <w:lvlText w:val="o"/>
+      <w:lvlJc w:val="left"/>
+      <w:pPr>
+        <w:ind w:left="5760" w:hanging="360"/>
+      </w:pPr>
+      <w:rPr>
+        <w:rFonts w:ascii="Courier New" w:hAnsi="Courier New" w:cs="Courier New" w:hint="default"/>
+      </w:rPr>
+    </w:lvl>
+    <w:lvl w:ilvl="8">
+      <w:numFmt w:val="bullet"/>
+      <w:lvlText w:val=""/>
+      <w:lvlJc w:val="left"/>
+      <w:pPr>
+        <w:ind w:left="6480" w:hanging="360"/>
+      </w:pPr>
+      <w:rPr>
+        <w:rFonts w:ascii="Wingdings" w:hAnsi="Wingdings" w:cs="Wingdings" w:hint="default"/>
+      </w:rPr>
     </w:lvl>
   </w:abstractNum>
   <w:num w:numId="1000">
@@ -1891,6 +2567,12 @@
   </w:num>
   <w:num w:numId="1011">
     <w:abstractNumId w:val="992"/>
+  </w:num>
+  <w:num w:numId="1012">
+    <w:abstractNumId w:val="991"/>
+  </w:num>
+  <w:num w:numId="1013">
+    <w:abstractNumId w:val="991"/>
   </w:num>
 </w:numbering>
 </file>

</xml_diff>